<commit_message>
resolve some pr comments and fix a test
</commit_message>
<xml_diff>
--- a/src/Apps/W1/PaymentPractices/App/src/Reports/Payment Practice Small Business.docx
+++ b/src/Apps/W1/PaymentPractices/App/src/Reports/Payment Practice Small Business.docx
@@ -3204,49 +3204,49 @@
  
          < T o o l t i p   c o l u m n = " M o d e _ P a y m e n t _ T i m e "   E l e m e n t I d = " 1 6 6 1 8 9 9 5 7 5 " >   
-             < T o o l t i p T e x t   l a n g = " e n - U S " > S p e c i f i e s   t h e   m o d e   p a y m e n t   t i m e . < / T o o l t i p T e x t > +             < T o o l t i p T e x t   l a n g = " e n - U S " > S p e c i f i e s   t h e   m o s t   f r e q u e n t l y   o c c u r r i n g   n u m b e r   o f   d a y s   t a k e n   t o   p a y   i n v o i c e s   d u r i n g   t h e   r e p o r t i n g   p e r i o d . < / T o o l t i p T e x t >   
          < / T o o l t i p >   
          < T o o l t i p   c o l u m n = " M o d e _ P a y m e n t _ T i m e _ M i n "   E l e m e n t I d = " 2 1 4 1 5 3 4 8 6 0 " >   
-             < T o o l t i p T e x t   l a n g = " e n - U S " > S p e c i f i e s   t h e   m i n i m u m   p e r   v e n d o r   m o d e   p a y m e n t   t i m e . < / T o o l t i p T e x t > +             < T o o l t i p T e x t   l a n g = " e n - U S " > S p e c i f i e s   t h e   l o w e s t   m o d e   p a y m e n t   t i m e ,   i n   d a y s ,   f o u n d   a c r o s s   a l l   v e n d o r s   i n   t h e   r e p o r t i n g   p e r i o d .   T h e   v a l u e   i s   c a l c u l a t e d   b y   d e t e r m i n i n g   t h e   m o d e   p a y m e n t   t i m e   f o r   e a c h   v e n d o r ,   w h i c h   i s   t h e   m o s t   f r e q u e n t l y   o c c u r r i n g   n u m b e r   o f   d a y s   t a k e n   t o   p a y   i n v o i c e s   f o r   t h a t   v e n d o r   d u r i n g   t h e   r e p o r t i n g   p e r i o d ,   a n d   t h e n   f i n d i n g   t h e   l o w e s t   v a l u e   a m o n g   t h o s e . < / T o o l t i p T e x t >   
          < / T o o l t i p >   
          < T o o l t i p   c o l u m n = " M o d e _ P a y m e n t _ T i m e _ M a x "   E l e m e n t I d = " 1 3 1 3 4 3 0 6 3 0 " >   
-             < T o o l t i p T e x t   l a n g = " e n - U S " > S p e c i f i e s   t h e   m a x i m u m   p e r   v e n d o r   m o d e   p a y m e n t   t i m e . < / T o o l t i p T e x t > +             < T o o l t i p T e x t   l a n g = " e n - U S " > S p e c i f i e s   t h e   h i g h e s t   m o d e   p a y m e n t   t i m e ,   i n   d a y s ,   f o u n d   a c r o s s   a l l   v e n d o r s   i n   t h e   r e p o r t i n g   p e r i o d .   T h e   v a l u e   i s   c a l c u l a t e d   b y   d e t e r m i n i n g   t h e   m o d e   p a y m e n t   t i m e   f o r   e a c h   v e n d o r ,   w h i c h   i s   t h e   m o s t   f r e q u e n t l y   o c c u r r i n g   n u m b e r   o f   d a y s   t a k e n   t o   p a y   i n v o i c e s   f o r   t h a t   v e n d o r   d u r i n g   t h e   r e p o r t i n g   p e r i o d ,   a n d   t h e n   f i n d i n g   t h e   h i g h e s t   v a l u e   a m o n g   t h o s e . < / T o o l t i p T e x t >   
          < / T o o l t i p >   
          < T o o l t i p   c o l u m n = " M e d i a n _ P a y m e n t _ T i m e "   E l e m e n t I d = " 1 8 0 6 6 0 6 2 0 0 " >   
-             < T o o l t i p T e x t   l a n g = " e n - U S " > S p e c i f i e s   t h e   m e d i a n   p a y m e n t   t i m e . < / T o o l t i p T e x t > +             < T o o l t i p T e x t   l a n g = " e n - U S " > S p e c i f i e s   t h e   m e d i a n   n u m b e r   o f   d a y s   t a k e n   t o   p a y   i n v o i c e s   d u r i n g   t h e   r e p o r t i n g   p e r i o d . < / T o o l t i p T e x t >   
          < / T o o l t i p >   
          < T o o l t i p   c o l u m n = " P e r c e n t i l e _ 8 0 t h _ P a y m e n t _ T i m e "   E l e m e n t I d = " 1 6 7 3 9 3 2 2 1 4 " >   
-             < T o o l t i p T e x t   l a n g = " e n - U S " > S p e c i f i e s   t h e   8 0 t h   p e r c e n t i l e   p a y m e n t   t i m e . < / T o o l t i p T e x t > +             < T o o l t i p T e x t   l a n g = " e n - U S " > S p e c i f i e s   t h e   n u m b e r   o f   d a y s   w i t h i n   w h i c h   8 0   p e r c e n t   o f   i n v o i c e s   w e r e   p a i d   d u r i n g   t h e   r e p o r t i n g   p e r i o d . < / T o o l t i p T e x t >   
          < / T o o l t i p >   
          < T o o l t i p   c o l u m n = " P e r c e n t i l e _ 9 5 t h _ P a y m e n t _ T i m e "   E l e m e n t I d = " 1 2 5 0 4 4 9 0 6 2 " >   
-             < T o o l t i p T e x t   l a n g = " e n - U S " > S p e c i f i e s   t h e   9 5 t h   p e r c e n t i l e   p a y m e n t   t i m e . < / T o o l t i p T e x t > +             < T o o l t i p T e x t   l a n g = " e n - U S " > S p e c i f i e s   t h e   n u m b e r   o f   d a y s   w i t h i n   w h i c h   9 5   p e r c e n t   o f   i n v o i c e s   w e r e   p a i d   d u r i n g   t h e   r e p o r t i n g   p e r i o d . < / T o o l t i p T e x t >   
          < / T o o l t i p >   
          < T o o l t i p   c o l u m n = " P c t _ P e p p o l _ E n a b l e d "   E l e m e n t I d = " 2 3 7 2 7 4 6 6 3 " >   
-             < T o o l t i p T e x t   l a n g = " e n - U S " > S p e c i f i e s   t h e   p e r c e n t a g e   o f   i n v o i c e s   t h a t   a r e   P E P P O L   e n a b l e d . < / T o o l t i p T e x t > +             < T o o l t i p T e x t   l a n g = " e n - U S " > S p e c i f i e s   t h e   p e r c e n t a g e   o f   i n v o i c e s   t h a t   w e r e   P E P P O L   e n a b l e d .   A n   i n v o i c e   i s   c o n s i d e r e d   P E P P O L   e n a b l e d   i f   t h e   v e n d o r   h a s   a   G L N . < / T o o l t i p T e x t >   
          < / T o o l t i p >   
          < T o o l t i p   c o l u m n = " P c t _ S m a l l _ B u s i n e s s _ P a y m e n t s "   E l e m e n t I d = " 1 7 5 4 6 3 8 1 8 1 " >   
-             < T o o l t i p T e x t   l a n g = " e n - U S " > S p e c i f i e s   s m a l l   b u s i n e s s   p a y m e n t s   a s   a   p e r c e n t a g e   o f   t o t a l   p a y m e n t s .   T h i s   i n c l u d e s   t h e   v a l u e   o f   p a r t i a l   p a y m e n t s . < / T o o l t i p T e x t > +             < T o o l t i p T e x t   l a n g = " e n - U S " > S p e c i f i e s   t h e   v a l u e   o f   p a y m e n t s   m a d e   t o   s m a l l   b u s i n e s s   v e n d o r s   a s   a   p e r c e n t a g e   o f   t o t a l   p a y m e n t s   i n   t h e   r e p o r t i n g   p e r i o d ,   i n c l u d i n g   p a r t i a l   p a y m e n t s .   A   v e n d o r   i s   c l a s s i f i e d   a s   a   s m a l l   b u s i n e s s   b a s e d   o n   t h e   c o m p a n y   s i z e   c o d e   o n   t h e   v e n d o r   r e c o r d . < / T o o l t i p T e x t >   
          < / T o o l t i p >   

</xml_diff>

<commit_message>
Update the prefix mappings for controls
 In SpendRequestDocument pathc the invalid prefix string
 `<xmlns:ns0` with the correct string `xmlns:ns0` and use the correct
 report id for the others (was 590 and should be 685).
</commit_message>
<xml_diff>
--- a/src/Apps/W1/PaymentPractices/App/src/Reports/Payment Practice Small Business.docx
+++ b/src/Apps/W1/PaymentPractices/App/src/Reports/Payment Practice Small Business.docx
@@ -1294,7 +1294,7 @@
                     <w:placeholder>
                       <w:docPart w:val="7C18CEEDF13642BE9903A213198E39EE"/>
                     </w:placeholder>
-                    <w15:dataBinding w:prefixMappings="xmlns:ns0='urn:microsoft-dynamics-nav/reports/Payment_Practice/590/' " w:xpath="/ns0:NavWordReportXmlPart[1]/ns0:PaymentPracticeHeader[1]/ns0:PaymentPracticeLine[1]/ns0:Line_Payment_Period_Description[1]" w:storeItemID="{70836790-78E2-4AC1-A094-CFE1139C1F3F}"/>
+                    <w15:dataBinding w:prefixMappings="xmlns:ns0='urn:microsoft-dynamics-nav/reports/Payment_Practice/685/' " w:xpath="/ns0:NavWordReportXmlPart[1]/ns0:PaymentPracticeHeader[1]/ns0:PaymentPracticeLine[1]/ns0:Line_Payment_Period_Description[1]" w:storeItemID="{70836790-78E2-4AC1-A094-CFE1139C1F3F}"/>
                   </w:sdtPr>
                   <w:sdtContent>
                     <w:tc>
@@ -1320,7 +1320,7 @@
                     <w:placeholder>
                       <w:docPart w:val="7C18CEEDF13642BE9903A213198E39EE"/>
                     </w:placeholder>
-                    <w15:dataBinding w:prefixMappings="xmlns:ns0='urn:microsoft-dynamics-nav/reports/Payment_Practice/590/' " w:xpath="/ns0:NavWordReportXmlPart[1]/ns0:PaymentPracticeHeader[1]/ns0:PaymentPracticeLine[1]/ns0:Line_Pct_Paid_in_Period[1]" w:storeItemID="{70836790-78E2-4AC1-A094-CFE1139C1F3F}"/>
+                    <w15:dataBinding w:prefixMappings="xmlns:ns0='urn:microsoft-dynamics-nav/reports/Payment_Practice/685/' " w:xpath="/ns0:NavWordReportXmlPart[1]/ns0:PaymentPracticeHeader[1]/ns0:PaymentPracticeLine[1]/ns0:Line_Pct_Paid_in_Period[1]" w:storeItemID="{70836790-78E2-4AC1-A094-CFE1139C1F3F}"/>
                   </w:sdtPr>
                   <w:sdtContent>
                     <w:tc>
@@ -1347,7 +1347,7 @@
                     <w:placeholder>
                       <w:docPart w:val="7C18CEEDF13642BE9903A213198E39EE"/>
                     </w:placeholder>
-                    <w15:dataBinding w:prefixMappings="xmlns:ns0='urn:microsoft-dynamics-nav/reports/Payment_Practice/590/' " w:xpath="/ns0:NavWordReportXmlPart[1]/ns0:PaymentPracticeHeader[1]/ns0:PaymentPracticeLine[1]/ns0:Line_Pct_Paid_in_Period__Amount_[1]" w:storeItemID="{70836790-78E2-4AC1-A094-CFE1139C1F3F}"/>
+                    <w15:dataBinding w:prefixMappings="xmlns:ns0='urn:microsoft-dynamics-nav/reports/Payment_Practice/685/' " w:xpath="/ns0:NavWordReportXmlPart[1]/ns0:PaymentPracticeHeader[1]/ns0:PaymentPracticeLine[1]/ns0:Line_Pct_Paid_in_Period__Amount_[1]" w:storeItemID="{70836790-78E2-4AC1-A094-CFE1139C1F3F}"/>
                   </w:sdtPr>
                   <w:sdtContent>
                     <w:tc>

</xml_diff>

<commit_message>
Bug 649158: [BcApps] Update word layouts with broken prefix mappings. (#11140)
## What & why

Several Word report layouts could not pass layout validation due to
prefix mapping errors

In SpendRequestDocument patch the invalid prefix string `<xmlns:ns0`
with the correct string `xmlns:ns0` and use the correct
 report id for the others (was 590 and should be 685).

All updates have been made using a platform tool, no manual edits have
been performed.

## Linked work

Fixes
[AB#649158](https://dynamicssmb2.visualstudio.com/1fcb79e7-ab07-432a-a3c6-6cf5a88ba4a5/_workitems/edit/649158)

## How I validated this

Process validated on platform side.
</commit_message>
<xml_diff>
--- a/src/Apps/W1/PaymentPractices/App/src/Reports/Payment Practice Small Business.docx
+++ b/src/Apps/W1/PaymentPractices/App/src/Reports/Payment Practice Small Business.docx
@@ -1294,7 +1294,7 @@
                     <w:placeholder>
                       <w:docPart w:val="7C18CEEDF13642BE9903A213198E39EE"/>
                     </w:placeholder>
-                    <w15:dataBinding w:prefixMappings="xmlns:ns0='urn:microsoft-dynamics-nav/reports/Payment_Practice/590/' " w:xpath="/ns0:NavWordReportXmlPart[1]/ns0:PaymentPracticeHeader[1]/ns0:PaymentPracticeLine[1]/ns0:Line_Payment_Period_Description[1]" w:storeItemID="{70836790-78E2-4AC1-A094-CFE1139C1F3F}"/>
+                    <w15:dataBinding w:prefixMappings="xmlns:ns0='urn:microsoft-dynamics-nav/reports/Payment_Practice/685/' " w:xpath="/ns0:NavWordReportXmlPart[1]/ns0:PaymentPracticeHeader[1]/ns0:PaymentPracticeLine[1]/ns0:Line_Payment_Period_Description[1]" w:storeItemID="{70836790-78E2-4AC1-A094-CFE1139C1F3F}"/>
                   </w:sdtPr>
                   <w:sdtContent>
                     <w:tc>
@@ -1320,7 +1320,7 @@
                     <w:placeholder>
                       <w:docPart w:val="7C18CEEDF13642BE9903A213198E39EE"/>
                     </w:placeholder>
-                    <w15:dataBinding w:prefixMappings="xmlns:ns0='urn:microsoft-dynamics-nav/reports/Payment_Practice/590/' " w:xpath="/ns0:NavWordReportXmlPart[1]/ns0:PaymentPracticeHeader[1]/ns0:PaymentPracticeLine[1]/ns0:Line_Pct_Paid_in_Period[1]" w:storeItemID="{70836790-78E2-4AC1-A094-CFE1139C1F3F}"/>
+                    <w15:dataBinding w:prefixMappings="xmlns:ns0='urn:microsoft-dynamics-nav/reports/Payment_Practice/685/' " w:xpath="/ns0:NavWordReportXmlPart[1]/ns0:PaymentPracticeHeader[1]/ns0:PaymentPracticeLine[1]/ns0:Line_Pct_Paid_in_Period[1]" w:storeItemID="{70836790-78E2-4AC1-A094-CFE1139C1F3F}"/>
                   </w:sdtPr>
                   <w:sdtContent>
                     <w:tc>
@@ -1347,7 +1347,7 @@
                     <w:placeholder>
                       <w:docPart w:val="7C18CEEDF13642BE9903A213198E39EE"/>
                     </w:placeholder>
-                    <w15:dataBinding w:prefixMappings="xmlns:ns0='urn:microsoft-dynamics-nav/reports/Payment_Practice/590/' " w:xpath="/ns0:NavWordReportXmlPart[1]/ns0:PaymentPracticeHeader[1]/ns0:PaymentPracticeLine[1]/ns0:Line_Pct_Paid_in_Period__Amount_[1]" w:storeItemID="{70836790-78E2-4AC1-A094-CFE1139C1F3F}"/>
+                    <w15:dataBinding w:prefixMappings="xmlns:ns0='urn:microsoft-dynamics-nav/reports/Payment_Practice/685/' " w:xpath="/ns0:NavWordReportXmlPart[1]/ns0:PaymentPracticeHeader[1]/ns0:PaymentPracticeLine[1]/ns0:Line_Pct_Paid_in_Period__Amount_[1]" w:storeItemID="{70836790-78E2-4AC1-A094-CFE1139C1F3F}"/>
                   </w:sdtPr>
                   <w:sdtContent>
                     <w:tc>

</xml_diff>